<commit_message>
Restore Personal Accomplishments section in resume draft
Co-Authored-By: Claude Fable 5 <noreply@anthropic.com>
Claude-Session: https://claude.ai/code/session_016QN66ikKHHeD1c1foEVg7w
</commit_message>
<xml_diff>
--- a/resume-drafts/Kurt Mansperger Resume - Operational CTO.docx
+++ b/resume-drafts/Kurt Mansperger Resume - Operational CTO.docx
@@ -1166,6 +1166,152 @@
           <w:szCs w:val="20"/>
         </w:rPr>
         <w:t xml:space="preserve">Leanstack Continuous Innovation Coach · Inquiry Method Life Coach · Agile Scrum Master · ITIL Fundamentals</w:t>
+      </w:r>
+    </w:p>
+    <w:p>
+      <w:pPr>
+        <w:pBdr>
+          <w:bottom w:val="single" w:color="5A6B2F" w:sz="6" w:space="2"/>
+        </w:pBdr>
+        <w:spacing w:after="80" w:before="220"/>
+      </w:pPr>
+      <w:r>
+        <w:rPr>
+          <w:rFonts w:ascii="Calibri" w:cs="Calibri" w:eastAsia="Calibri" w:hAnsi="Calibri"/>
+          <w:b/>
+          <w:bCs/>
+          <w:caps/>
+          <w:color w:val="5A6B2F"/>
+          <w:sz w:val="22"/>
+          <w:szCs w:val="22"/>
+        </w:rPr>
+        <w:t xml:space="preserve">Personal Accomplishments</w:t>
+      </w:r>
+    </w:p>
+    <w:p>
+      <w:pPr>
+        <w:pStyle w:val="ListParagraph"/>
+        <w:numPr>
+          <w:ilvl w:val="0"/>
+          <w:numId w:val="2"/>
+        </w:numPr>
+        <w:spacing w:after="40" w:line="252"/>
+      </w:pPr>
+      <w:r>
+        <w:rPr>
+          <w:rFonts w:ascii="Calibri" w:cs="Calibri" w:eastAsia="Calibri" w:hAnsi="Calibri"/>
+          <w:b w:val="false"/>
+          <w:bCs w:val="false"/>
+          <w:color w:val="222222"/>
+          <w:sz w:val="20"/>
+          <w:szCs w:val="20"/>
+        </w:rPr>
+        <w:t xml:space="preserve">Created memorable culinary experiences</w:t>
+      </w:r>
+    </w:p>
+    <w:p>
+      <w:pPr>
+        <w:pStyle w:val="ListParagraph"/>
+        <w:numPr>
+          <w:ilvl w:val="0"/>
+          <w:numId w:val="2"/>
+        </w:numPr>
+        <w:spacing w:after="40" w:line="252"/>
+      </w:pPr>
+      <w:r>
+        <w:rPr>
+          <w:rFonts w:ascii="Calibri" w:cs="Calibri" w:eastAsia="Calibri" w:hAnsi="Calibri"/>
+          <w:b w:val="false"/>
+          <w:bCs w:val="false"/>
+          <w:color w:val="222222"/>
+          <w:sz w:val="20"/>
+          <w:szCs w:val="20"/>
+        </w:rPr>
+        <w:t xml:space="preserve">Refined negotiation tactics with my kindergartner</w:t>
+      </w:r>
+    </w:p>
+    <w:p>
+      <w:pPr>
+        <w:pStyle w:val="ListParagraph"/>
+        <w:numPr>
+          <w:ilvl w:val="0"/>
+          <w:numId w:val="2"/>
+        </w:numPr>
+        <w:spacing w:after="40" w:line="252"/>
+      </w:pPr>
+      <w:r>
+        <w:rPr>
+          <w:rFonts w:ascii="Calibri" w:cs="Calibri" w:eastAsia="Calibri" w:hAnsi="Calibri"/>
+          <w:b w:val="false"/>
+          <w:bCs w:val="false"/>
+          <w:color w:val="222222"/>
+          <w:sz w:val="20"/>
+          <w:szCs w:val="20"/>
+        </w:rPr>
+        <w:t xml:space="preserve">Transformed a 1930’s cottage into a home</w:t>
+      </w:r>
+    </w:p>
+    <w:p>
+      <w:pPr>
+        <w:pStyle w:val="ListParagraph"/>
+        <w:numPr>
+          <w:ilvl w:val="0"/>
+          <w:numId w:val="2"/>
+        </w:numPr>
+        <w:spacing w:after="40" w:line="252"/>
+      </w:pPr>
+      <w:r>
+        <w:rPr>
+          <w:rFonts w:ascii="Calibri" w:cs="Calibri" w:eastAsia="Calibri" w:hAnsi="Calibri"/>
+          <w:b w:val="false"/>
+          <w:bCs w:val="false"/>
+          <w:color w:val="222222"/>
+          <w:sz w:val="20"/>
+          <w:szCs w:val="20"/>
+        </w:rPr>
+        <w:t xml:space="preserve">Reclaimed wood and gave it a new life</w:t>
+      </w:r>
+    </w:p>
+    <w:p>
+      <w:pPr>
+        <w:pStyle w:val="ListParagraph"/>
+        <w:numPr>
+          <w:ilvl w:val="0"/>
+          <w:numId w:val="2"/>
+        </w:numPr>
+        <w:spacing w:after="40" w:line="252"/>
+      </w:pPr>
+      <w:r>
+        <w:rPr>
+          <w:rFonts w:ascii="Calibri" w:cs="Calibri" w:eastAsia="Calibri" w:hAnsi="Calibri"/>
+          <w:b w:val="false"/>
+          <w:bCs w:val="false"/>
+          <w:color w:val="222222"/>
+          <w:sz w:val="20"/>
+          <w:szCs w:val="20"/>
+        </w:rPr>
+        <w:t xml:space="preserve">Biked across New England</w:t>
+      </w:r>
+    </w:p>
+    <w:p>
+      <w:pPr>
+        <w:pStyle w:val="ListParagraph"/>
+        <w:numPr>
+          <w:ilvl w:val="0"/>
+          <w:numId w:val="2"/>
+        </w:numPr>
+        <w:spacing w:after="40" w:line="252"/>
+      </w:pPr>
+      <w:r>
+        <w:rPr>
+          <w:rFonts w:ascii="Calibri" w:cs="Calibri" w:eastAsia="Calibri" w:hAnsi="Calibri"/>
+          <w:b w:val="false"/>
+          <w:bCs w:val="false"/>
+          <w:color w:val="222222"/>
+          <w:sz w:val="20"/>
+          <w:szCs w:val="20"/>
+        </w:rPr>
+        <w:t xml:space="preserve">Sailed our home from New York to Boston</w:t>
       </w:r>
     </w:p>
     <w:sectPr>

</xml_diff>

<commit_message>
Rework resume voice: plainer phrasing, fewer em-dashes
Rewrote the summary in a more natural register, removed phrases
borrowed verbatim from a job posting, and converted mid-sentence
em-dashes to plainer punctuation throughout the bullets.

Co-Authored-By: Claude Fable 5 <noreply@anthropic.com>
Claude-Session: https://claude.ai/code/session_016QN66ikKHHeD1c1foEVg7w
</commit_message>
<xml_diff>
--- a/resume-drafts/Kurt Mansperger Resume - Operational CTO.docx
+++ b/resume-drafts/Kurt Mansperger Resume - Operational CTO.docx
@@ -63,7 +63,7 @@
           <w:sz w:val="20"/>
           <w:szCs w:val="20"/>
         </w:rPr>
-        <w:t xml:space="preserve">Operational technology executive with 18+ years putting reliable foundations under growing, people-powered organizations. As CTO of the Boston Public Library, I owned technology for a 500-person, largely unionized frontline workforce across 27 locations; as a fractional CTO, I hardened security for a 30,000-person staffing organization; as an architect, I rebuilt the billing system of record for a $1B+ SaaS company. I build data warehouses and dashboards that leaders actually use, workforce tools with labor rules built into the architecture, and teams that document and train so no critical system depends on one person’s memory. I choose buy vs. build deliberately — and I start by understanding why the systems I inherit work before deciding what to change.</w:t>
+        <w:t xml:space="preserve">Operational technology executive with 18+ years building the systems that growing, people-heavy organizations run on. As CTO of the Boston Public Library I owned technology for 500 unionized staff across 27 locations; as a fractional CTO I hardened security for a 30,000-person staffing firm; earlier in my career I architected the billing system of record for a $1B+ SaaS company. My work centers on data people trust, workforce tools that respect labor rules, deliberate buy-vs-build decisions, and teams trained and documented well enough to outlast me.</w:t>
       </w:r>
     </w:p>
     <w:p>
@@ -170,7 +170,7 @@
           <w:sz w:val="20"/>
           <w:szCs w:val="20"/>
         </w:rPr>
-        <w:t xml:space="preserve">Direct technology and data transformations for PE-backed SaaS companies (500+ employees) — improving data integrity, accelerating reporting cycles, and giving boards reliable visibility into ARR, renewals, and operational KPIs.</w:t>
+        <w:t xml:space="preserve">Direct technology and data transformations for PE-backed SaaS companies (500+ employees), improving data integrity, accelerating reporting cycles, and giving boards reliable visibility into ARR, renewals, and operational KPIs.</w:t>
       </w:r>
     </w:p>
     <w:p>
@@ -212,7 +212,7 @@
           <w:sz w:val="20"/>
           <w:szCs w:val="20"/>
         </w:rPr>
-        <w:t xml:space="preserve">Managed multi-country offshore teams building data warehouses, coaching engineers to understand the “why” behind their work and approach problems holistically — driving higher-quality output and increased efficiency.</w:t>
+        <w:t xml:space="preserve">Managed multi-country offshore teams building data warehouses, coaching engineers to understand the “why” behind their work and approach problems holistically, driving higher-quality output and increased efficiency.</w:t>
       </w:r>
     </w:p>
     <w:p>
@@ -254,7 +254,7 @@
           <w:sz w:val="20"/>
           <w:szCs w:val="20"/>
         </w:rPr>
-        <w:t xml:space="preserve">Built an AI-powered contract-intelligence tool that converts unstructured PDFs into structured contract terms to validate subscription and billing data — uncovering revenue leakage across multiple clients.</w:t>
+        <w:t xml:space="preserve">Built an AI-powered contract-intelligence tool that converts unstructured PDFs into structured contract terms to validate subscription and billing data, uncovering revenue leakage across multiple clients.</w:t>
       </w:r>
     </w:p>
     <w:p>
@@ -337,28 +337,28 @@
           <w:sz w:val="20"/>
           <w:szCs w:val="20"/>
         </w:rPr>
-        <w:t xml:space="preserve">Conducted an enterprise-wide security assessment for a staffing organization with 30,000+ distributed staff — improving configuration of core systems and delivering targeted training that materially strengthened its security posture.</w:t>
-      </w:r>
-    </w:p>
-    <w:p>
-      <w:pPr>
-        <w:pStyle w:val="ListParagraph"/>
-        <w:numPr>
-          <w:ilvl w:val="0"/>
-          <w:numId w:val="2"/>
-        </w:numPr>
-        <w:spacing w:after="40" w:line="252"/>
-      </w:pPr>
-      <w:r>
-        <w:rPr>
-          <w:rFonts w:ascii="Calibri" w:cs="Calibri" w:eastAsia="Calibri" w:hAnsi="Calibri"/>
-          <w:b w:val="false"/>
-          <w:bCs w:val="false"/>
-          <w:color w:val="222222"/>
-          <w:sz w:val="20"/>
-          <w:szCs w:val="20"/>
-        </w:rPr>
-        <w:t xml:space="preserve">Selected, implemented, and integrated core business systems for five organizations — standardizing processes, enhancing reporting, and saving hundreds of hours annually.</w:t>
+        <w:t xml:space="preserve">Conducted an enterprise-wide security assessment for a staffing organization with 30,000+ distributed staff, improving configuration of core systems and delivering targeted training that materially strengthened its security posture.</w:t>
+      </w:r>
+    </w:p>
+    <w:p>
+      <w:pPr>
+        <w:pStyle w:val="ListParagraph"/>
+        <w:numPr>
+          <w:ilvl w:val="0"/>
+          <w:numId w:val="2"/>
+        </w:numPr>
+        <w:spacing w:after="40" w:line="252"/>
+      </w:pPr>
+      <w:r>
+        <w:rPr>
+          <w:rFonts w:ascii="Calibri" w:cs="Calibri" w:eastAsia="Calibri" w:hAnsi="Calibri"/>
+          <w:b w:val="false"/>
+          <w:bCs w:val="false"/>
+          <w:color w:val="222222"/>
+          <w:sz w:val="20"/>
+          <w:szCs w:val="20"/>
+        </w:rPr>
+        <w:t xml:space="preserve">Selected, implemented, and integrated core business systems for five organizations, standardizing processes, enhancing reporting, and saving hundreds of hours annually.</w:t>
       </w:r>
     </w:p>
     <w:p>
@@ -462,7 +462,7 @@
           <w:sz w:val="20"/>
           <w:szCs w:val="20"/>
         </w:rPr>
-        <w:t xml:space="preserve">Owned technology strategy and operations for a 500-person, largely unionized frontline workforce across 27 locations serving 4 million+ patrons — leading 5 managers and 20 IT staff on a $5M annual budget.</w:t>
+        <w:t xml:space="preserve">Owned technology strategy and operations for a 500-person, largely unionized frontline workforce across 27 locations serving 4 million+ patrons, leading 5 managers and 20 IT staff on a $5M annual budget.</w:t>
       </w:r>
     </w:p>
     <w:p>
@@ -504,28 +504,28 @@
           <w:sz w:val="20"/>
           <w:szCs w:val="20"/>
         </w:rPr>
-        <w:t xml:space="preserve">Designed and shipped a shift-filling app that saved supervisors ~30 hours per week — with union work rules built into the system’s logic rather than enforced by hand (Airtable, Twilio, Next.js).</w:t>
-      </w:r>
-    </w:p>
-    <w:p>
-      <w:pPr>
-        <w:pStyle w:val="ListParagraph"/>
-        <w:numPr>
-          <w:ilvl w:val="0"/>
-          <w:numId w:val="2"/>
-        </w:numPr>
-        <w:spacing w:after="40" w:line="252"/>
-      </w:pPr>
-      <w:r>
-        <w:rPr>
-          <w:rFonts w:ascii="Calibri" w:cs="Calibri" w:eastAsia="Calibri" w:hAnsi="Calibri"/>
-          <w:b w:val="false"/>
-          <w:bCs w:val="false"/>
-          <w:color w:val="222222"/>
-          <w:sz w:val="20"/>
-          <w:szCs w:val="20"/>
-        </w:rPr>
-        <w:t xml:space="preserve">Led development and rollout of an analytics platform (Power BI via Azure Data Factory) that field leaders actually used — saving 1,500+ hours of manual data collection annually and fostering a culture of data-informed decisions.</w:t>
+        <w:t xml:space="preserve">Designed and shipped a shift-filling app that saved supervisors ~30 hours per week, with union work rules built into the system’s logic (Airtable, Twilio, Next.js).</w:t>
+      </w:r>
+    </w:p>
+    <w:p>
+      <w:pPr>
+        <w:pStyle w:val="ListParagraph"/>
+        <w:numPr>
+          <w:ilvl w:val="0"/>
+          <w:numId w:val="2"/>
+        </w:numPr>
+        <w:spacing w:after="40" w:line="252"/>
+      </w:pPr>
+      <w:r>
+        <w:rPr>
+          <w:rFonts w:ascii="Calibri" w:cs="Calibri" w:eastAsia="Calibri" w:hAnsi="Calibri"/>
+          <w:b w:val="false"/>
+          <w:bCs w:val="false"/>
+          <w:color w:val="222222"/>
+          <w:sz w:val="20"/>
+          <w:szCs w:val="20"/>
+        </w:rPr>
+        <w:t xml:space="preserve">Led development and rollout of an analytics platform (Power BI via Azure Data Factory) that leaders across the organization relied on daily, saving 1,500+ hours of manual data collection annually and fostering a culture of data-informed decisions.</w:t>
       </w:r>
     </w:p>
     <w:p>
@@ -567,7 +567,7 @@
           <w:sz w:val="20"/>
           <w:szCs w:val="20"/>
         </w:rPr>
-        <w:t xml:space="preserve">Moved 500+ staff to remote work during COVID-19 — procuring, architecting, and rolling out the systems and processes to keep a newly distributed workforce productive.</w:t>
+        <w:t xml:space="preserve">Moved 500+ staff to remote work during COVID-19, procuring, architecting, and rolling out the systems and processes to keep a newly distributed workforce productive.</w:t>
       </w:r>
     </w:p>
     <w:p>
@@ -609,28 +609,28 @@
           <w:sz w:val="20"/>
           <w:szCs w:val="20"/>
         </w:rPr>
-        <w:t xml:space="preserve">Built a model-driven application (MS Power Platform) improving social-worker data collection and analysis — yielding a more holistic view of patron interactions and stronger metrics for funding reports.</w:t>
-      </w:r>
-    </w:p>
-    <w:p>
-      <w:pPr>
-        <w:pStyle w:val="ListParagraph"/>
-        <w:numPr>
-          <w:ilvl w:val="0"/>
-          <w:numId w:val="2"/>
-        </w:numPr>
-        <w:spacing w:after="40" w:line="252"/>
-      </w:pPr>
-      <w:r>
-        <w:rPr>
-          <w:rFonts w:ascii="Calibri" w:cs="Calibri" w:eastAsia="Calibri" w:hAnsi="Calibri"/>
-          <w:b w:val="false"/>
-          <w:bCs w:val="false"/>
-          <w:color w:val="222222"/>
-          <w:sz w:val="20"/>
-          <w:szCs w:val="20"/>
-        </w:rPr>
-        <w:t xml:space="preserve">Rebuilt team culture around empathy, accountability, and operational excellence — cutting ~400 hours of meetings annually while boosting productivity and engagement.</w:t>
+        <w:t xml:space="preserve">Built a model-driven application (MS Power Platform) improving social-worker data collection and analysis, yielding a more holistic view of patron interactions and stronger metrics for funding reports.</w:t>
+      </w:r>
+    </w:p>
+    <w:p>
+      <w:pPr>
+        <w:pStyle w:val="ListParagraph"/>
+        <w:numPr>
+          <w:ilvl w:val="0"/>
+          <w:numId w:val="2"/>
+        </w:numPr>
+        <w:spacing w:after="40" w:line="252"/>
+      </w:pPr>
+      <w:r>
+        <w:rPr>
+          <w:rFonts w:ascii="Calibri" w:cs="Calibri" w:eastAsia="Calibri" w:hAnsi="Calibri"/>
+          <w:b w:val="false"/>
+          <w:bCs w:val="false"/>
+          <w:color w:val="222222"/>
+          <w:sz w:val="20"/>
+          <w:szCs w:val="20"/>
+        </w:rPr>
+        <w:t xml:space="preserve">Rebuilt team culture around empathy, accountability, and operational excellence, cutting ~400 hours of meetings annually while boosting productivity and engagement.</w:t>
       </w:r>
     </w:p>
     <w:p>
@@ -796,7 +796,7 @@
           <w:sz w:val="20"/>
           <w:szCs w:val="20"/>
         </w:rPr>
-        <w:t xml:space="preserve">Architected the post-acquisition overhaul of a $1B+ SaaS conglomerate’s billing system — its financial system of record — improving scalability, agility, and flexibility while generating $10M+ in annual revenue growth and reducing technical debt.</w:t>
+        <w:t xml:space="preserve">Architected the post-acquisition overhaul of a $1B+ SaaS conglomerate’s billing system (its financial system of record), improving scalability, agility, and flexibility while generating $10M+ in annual revenue growth and reducing technical debt.</w:t>
       </w:r>
     </w:p>
     <w:p>
@@ -900,7 +900,7 @@
           <w:sz w:val="20"/>
           <w:szCs w:val="20"/>
         </w:rPr>
-        <w:t xml:space="preserve">Led up to 8-person teams implementing statewide eligibility systems (Medicaid, Unemployment Insurance, Nutritional Assistance) — regulation-dense government systems where compliance is part of the architecture, not an afterthought.</w:t>
+        <w:t xml:space="preserve">Led up to 8-person teams implementing statewide eligibility systems (Medicaid, Unemployment Insurance, Nutritional Assistance), regulation-dense government systems where the compliance requirements drove the design.</w:t>
       </w:r>
     </w:p>
     <w:p>
@@ -1015,7 +1015,7 @@
           <w:sz w:val="20"/>
           <w:szCs w:val="20"/>
         </w:rPr>
-        <w:t xml:space="preserve"> (2014 – Present) — community-driven nonprofit in Bucerías, Mexico; guide strategy and manage web presence and financials.</w:t>
+        <w:t xml:space="preserve"> (2014 – Present): community-driven nonprofit in Bucerías, Mexico; guide strategy and manage web presence and financials.</w:t>
       </w:r>
     </w:p>
     <w:p>
@@ -1047,7 +1047,7 @@
           <w:sz w:val="20"/>
           <w:szCs w:val="20"/>
         </w:rPr>
-        <w:t xml:space="preserve"> (2008 – 2015) — international 501(c)(3) combining microfinance and tourism; took a six-month sabbatical from Deloitte to run on-the-ground operations in Mexico, hosting 550+ tour participants and distributing 175+ micro-loans.</w:t>
+        <w:t xml:space="preserve"> (2008 – 2015): international 501(c)(3) combining microfinance and tourism; took a six-month sabbatical from Deloitte to run on-the-ground operations in Mexico, hosting 550+ tour participants and distributing 175+ micro-loans.</w:t>
       </w:r>
     </w:p>
     <w:p>
@@ -1099,7 +1099,7 @@
           <w:sz w:val="20"/>
           <w:szCs w:val="20"/>
         </w:rPr>
-        <w:t xml:space="preserve">, University of Maryland, College Park — IEEE; Solar Decathlon (Smart Home Team)</w:t>
+        <w:t xml:space="preserve">, University of Maryland, College Park · IEEE; Solar Decathlon (Smart Home Team)</w:t>
       </w:r>
     </w:p>
     <w:p>
@@ -1131,7 +1131,7 @@
           <w:sz w:val="20"/>
           <w:szCs w:val="20"/>
         </w:rPr>
-        <w:t xml:space="preserve">, University of Maryland, College Park — QUEST Honors Program (Six Sigma); Hinman CEOs (Entrepreneurship)</w:t>
+        <w:t xml:space="preserve">, University of Maryland, College Park · QUEST Honors Program (Six Sigma); Hinman CEOs (Entrepreneurship)</w:t>
       </w:r>
     </w:p>
     <w:p>

</xml_diff>

<commit_message>
Add current data and AI project bullets to Techtorch role
Co-Authored-By: Claude Fable 5 <noreply@anthropic.com>
Claude-Session: https://claude.ai/code/session_016QN66ikKHHeD1c1foEVg7w
</commit_message>
<xml_diff>
--- a/resume-drafts/Kurt Mansperger Resume - Operational CTO.docx
+++ b/resume-drafts/Kurt Mansperger Resume - Operational CTO.docx
@@ -170,7 +170,70 @@
           <w:sz w:val="20"/>
           <w:szCs w:val="20"/>
         </w:rPr>
-        <w:t xml:space="preserve">Direct technology and data transformations for PE-backed SaaS companies (500+ employees), improving data integrity, accelerating reporting cycles, and giving boards reliable visibility into ARR, renewals, and operational KPIs.</w:t>
+        <w:t xml:space="preserve">Direct technology and data transformations for PE-backed SaaS companies (500+ employees), improving data integrity, accelerating reporting cycles, and giving boards reliable visibility into ARR, renewals, and operational KPIs, including month-end close processes that unify customer records across ERP and CRM systems (NetSuite, Sage, Salesforce).</w:t>
+      </w:r>
+    </w:p>
+    <w:p>
+      <w:pPr>
+        <w:pStyle w:val="ListParagraph"/>
+        <w:numPr>
+          <w:ilvl w:val="0"/>
+          <w:numId w:val="2"/>
+        </w:numPr>
+        <w:spacing w:after="40" w:line="252"/>
+      </w:pPr>
+      <w:r>
+        <w:rPr>
+          <w:rFonts w:ascii="Calibri" w:cs="Calibri" w:eastAsia="Calibri" w:hAnsi="Calibri"/>
+          <w:b w:val="false"/>
+          <w:bCs w:val="false"/>
+          <w:color w:val="222222"/>
+          <w:sz w:val="20"/>
+          <w:szCs w:val="20"/>
+        </w:rPr>
+        <w:t xml:space="preserve">Technical lead for an AI-powered data ingestion and entity-matching platform at a media-measurement company that processes 270,000 files daily, projected to cut manual file review by 98% and manual match work by 95% (roughly $2M in annual savings); presented working demos to the client’s board and investors.</w:t>
+      </w:r>
+    </w:p>
+    <w:p>
+      <w:pPr>
+        <w:pStyle w:val="ListParagraph"/>
+        <w:numPr>
+          <w:ilvl w:val="0"/>
+          <w:numId w:val="2"/>
+        </w:numPr>
+        <w:spacing w:after="40" w:line="252"/>
+      </w:pPr>
+      <w:r>
+        <w:rPr>
+          <w:rFonts w:ascii="Calibri" w:cs="Calibri" w:eastAsia="Calibri" w:hAnsi="Calibri"/>
+          <w:b w:val="false"/>
+          <w:bCs w:val="false"/>
+          <w:color w:val="222222"/>
+          <w:sz w:val="20"/>
+          <w:szCs w:val="20"/>
+        </w:rPr>
+        <w:t xml:space="preserve">Built and refined a natural-language query interface that lets the client’s non-technical customers answer complex data questions without writing SQL, and led user acceptance testing with their analysts.</w:t>
+      </w:r>
+    </w:p>
+    <w:p>
+      <w:pPr>
+        <w:pStyle w:val="ListParagraph"/>
+        <w:numPr>
+          <w:ilvl w:val="0"/>
+          <w:numId w:val="2"/>
+        </w:numPr>
+        <w:spacing w:after="40" w:line="252"/>
+      </w:pPr>
+      <w:r>
+        <w:rPr>
+          <w:rFonts w:ascii="Calibri" w:cs="Calibri" w:eastAsia="Calibri" w:hAnsi="Calibri"/>
+          <w:b w:val="false"/>
+          <w:bCs w:val="false"/>
+          <w:color w:val="222222"/>
+          <w:sz w:val="20"/>
+          <w:szCs w:val="20"/>
+        </w:rPr>
+        <w:t xml:space="preserve">Designed the data architecture for a multi-site healthcare organization (Snowflake, Fivetran), selecting ingestion tooling that meets HIPAA requirements and prioritizing KPIs with the executive team.</w:t>
       </w:r>
     </w:p>
     <w:p>

</xml_diff>